<commit_message>
Renommage : « Base » remplace l'ancien sigle dans tout le dépôt
Texte, identifiants (effectif_base_total, part_emploi_base_national_pct,
classe_poids_base, classer_poids_base, sirens_base), spécifications, tests,
README, utilitaires, pages HTML et CSV de sorties/ ; fiche pédagogique
renommée fiche_pedagogique_typologie_Base.docx et régénérée (images, Word,
aperçu PDF) ; cartes PNG et quadrants régénérés (mot rendu dans les images).
Aucun calcul, seuil ni règle modifié. Suite complète : 0 échec, 1 skip.

Co-Authored-By: Claude Fable 5.1 <noreply@anthropic.com>
Claude-Session: https://claude.ai/code/session_01UpdBM8LNqaxjQDVfn5Cm1N
</commit_message>
<xml_diff>
--- a/sorties/typologie_territoriale/fiche_pedagogique_typologie_Base.docx
+++ b/sorties/typologie_territoriale/fiche_pedagogique_typologie_Base.docx
@@ -16,7 +16,7 @@
           <w:sz w:val="17"/>
           <w:szCs w:val="17"/>
         </w:rPr>
-        <w:t xml:space="preserve">Typologie des territoires BITD  ·  fiche de lecture  ·  1 / 4</w:t>
+        <w:t xml:space="preserve">Typologie des territoires Base  ·  fiche de lecture  ·  1 / 4</w:t>
       </w:r>
     </w:p>
     <w:p>
@@ -166,7 +166,7 @@
                 <w:sz w:val="23"/>
                 <w:szCs w:val="23"/>
               </w:rPr>
-              <w:t xml:space="preserve">Quelle place occupe ce département dans l’emploi BITD national ?</w:t>
+              <w:t xml:space="preserve">Quelle place occupe ce département dans l’emploi Base national ?</w:t>
             </w:r>
           </w:p>
           <w:p>
@@ -225,7 +225,7 @@
                 <w:sz w:val="23"/>
                 <w:szCs w:val="23"/>
               </w:rPr>
-              <w:t xml:space="preserve">Sur 100 salariés de la BITD en France, combien travaillent ici ? Ici, 8 sur 100. Classé faible, moyen ou fort. Un très petit effectif est toujours classé « faible ».</w:t>
+              <w:t xml:space="preserve">Sur 100 salariés de la Base en France, combien travaillent ici ? Ici, 8 sur 100. Classé faible, moyen ou fort. Un très petit effectif est toujours classé « faible ».</w:t>
             </w:r>
           </w:p>
         </w:tc>
@@ -878,7 +878,7 @@
           <w:sz w:val="17"/>
           <w:szCs w:val="17"/>
         </w:rPr>
-        <w:t xml:space="preserve">Typologie des territoires BITD  ·  fiche de lecture  ·  2 / 4</w:t>
+        <w:t xml:space="preserve">Typologie des territoires Base  ·  fiche de lecture  ·  2 / 4</w:t>
       </w:r>
     </w:p>
     <w:p>
@@ -3344,7 +3344,7 @@
           <w:sz w:val="17"/>
           <w:szCs w:val="17"/>
         </w:rPr>
-        <w:t xml:space="preserve">Typologie des territoires BITD  ·  fiche de lecture  ·  3 / 4</w:t>
+        <w:t xml:space="preserve">Typologie des territoires Base  ·  fiche de lecture  ·  3 / 4</w:t>
       </w:r>
     </w:p>
     <w:p>
@@ -3522,7 +3522,7 @@
                 <w:sz w:val="24"/>
                 <w:szCs w:val="24"/>
               </w:rPr>
-              <w:t xml:space="preserve">Un grand pôle de la BITD où beaucoup de salariés pourraient partir, et où ces départs représentent une part importante des effectifs actuels.</w:t>
+              <w:t xml:space="preserve">Un grand pôle de la Base où beaucoup de salariés pourraient partir, et où ces départs représentent une part importante des effectifs actuels.</w:t>
             </w:r>
           </w:p>
           <w:p>
@@ -3588,7 +3588,7 @@
                 <w:sz w:val="24"/>
                 <w:szCs w:val="24"/>
               </w:rPr>
-              <w:t xml:space="preserve">8 % de l’emploi BITD national · 900 départs estimés · 14 % de l’emploi actuel à remplacer.</w:t>
+              <w:t xml:space="preserve">8 % de l’emploi Base national · 900 départs estimés · 14 % de l’emploi actuel à remplacer.</w:t>
             </w:r>
           </w:p>
           <w:p>
@@ -4419,7 +4419,7 @@
           <w:sz w:val="17"/>
           <w:szCs w:val="17"/>
         </w:rPr>
-        <w:t xml:space="preserve">Typologie des territoires BITD  ·  fiche de lecture  ·  4 / 4</w:t>
+        <w:t xml:space="preserve">Typologie des territoires Base  ·  fiche de lecture  ·  4 / 4</w:t>
       </w:r>
     </w:p>
     <w:p>
@@ -4848,7 +4848,7 @@
                 <w:sz w:val="24"/>
                 <w:szCs w:val="24"/>
               </w:rPr>
-              <w:t xml:space="preserve">La BITD pèse peu dans ce département, ou y repose sur très peu de salariés.</w:t>
+              <w:t xml:space="preserve">La Base pèse peu dans ce département, ou y repose sur très peu de salariés.</w:t>
             </w:r>
           </w:p>
           <w:p>

</xml_diff>